<commit_message>
Started the Research Work
</commit_message>
<xml_diff>
--- a/Research Work/VPPA Bibliography.docx
+++ b/Research Work/VPPA Bibliography.docx
@@ -293,7 +293,6 @@
       <w:pPr>
         <w:spacing w:after="240" w:line="480" w:lineRule="auto"/>
         <w:ind w:left="720" w:hanging="720"/>
-        <w:jc w:val="both"/>
         <w:rPr>
           <w:sz w:val="24"/>
           <w:szCs w:val="24"/>
@@ -314,9 +313,9 @@
           <w:sz w:val="24"/>
           <w:szCs w:val="24"/>
         </w:rPr>
-        <w:t xml:space="preserve">FTC </w:t>
-      </w:r>
-      <w:proofErr w:type="gramStart"/>
+        <w:t xml:space="preserve">FTC to ban </w:t>
+      </w:r>
+      <w:proofErr w:type="spellStart"/>
       <w:r>
         <w:rPr>
           <w:rFonts w:eastAsiaTheme="majorEastAsia"/>
@@ -325,9 +324,9 @@
           <w:sz w:val="24"/>
           <w:szCs w:val="24"/>
         </w:rPr>
-        <w:t>to ban</w:t>
-      </w:r>
-      <w:proofErr w:type="gramEnd"/>
+        <w:t>BetterHelp</w:t>
+      </w:r>
+      <w:proofErr w:type="spellEnd"/>
       <w:r>
         <w:rPr>
           <w:rFonts w:eastAsiaTheme="majorEastAsia"/>
@@ -336,9 +335,9 @@
           <w:sz w:val="24"/>
           <w:szCs w:val="24"/>
         </w:rPr>
-        <w:t xml:space="preserve"> </w:t>
-      </w:r>
-      <w:proofErr w:type="spellStart"/>
+        <w:t xml:space="preserve"> from revealing consumers’ data, including sensitive mental health information, to Facebook and others for targeted </w:t>
+      </w:r>
+      <w:proofErr w:type="gramStart"/>
       <w:r>
         <w:rPr>
           <w:rFonts w:eastAsiaTheme="majorEastAsia"/>
@@ -347,9 +346,41 @@
           <w:sz w:val="24"/>
           <w:szCs w:val="24"/>
         </w:rPr>
-        <w:t>BetterHelp</w:t>
-      </w:r>
-      <w:proofErr w:type="spellEnd"/>
+        <w:t>advertising</w:t>
+      </w:r>
+      <w:r>
+        <w:rPr>
+          <w:sz w:val="24"/>
+          <w:szCs w:val="24"/>
+        </w:rPr>
+        <w:t>.</w:t>
+      </w:r>
+      <w:r>
+        <w:rPr>
+          <w:sz w:val="24"/>
+          <w:szCs w:val="24"/>
+        </w:rPr>
+        <w:t>https://www.ftc.gov/news-events/news/press-releases/2023/03/ftc-ban-betterhelp-revealing-consumers-data-including-sensitive-mental-health-information-facebook</w:t>
+      </w:r>
+      <w:proofErr w:type="gramEnd"/>
+    </w:p>
+    <w:p>
+      <w:pPr>
+        <w:spacing w:after="240" w:line="480" w:lineRule="auto"/>
+        <w:ind w:left="720" w:hanging="720"/>
+        <w:jc w:val="both"/>
+        <w:rPr>
+          <w:sz w:val="24"/>
+          <w:szCs w:val="24"/>
+        </w:rPr>
+      </w:pPr>
+      <w:r>
+        <w:rPr>
+          <w:sz w:val="24"/>
+          <w:szCs w:val="24"/>
+        </w:rPr>
+        <w:t xml:space="preserve">Federal Trade Commission. (2023, July 20). </w:t>
+      </w:r>
       <w:r>
         <w:rPr>
           <w:rFonts w:eastAsiaTheme="majorEastAsia"/>
@@ -358,52 +389,6 @@
           <w:sz w:val="24"/>
           <w:szCs w:val="24"/>
         </w:rPr>
-        <w:t xml:space="preserve"> from revealing consumers’ data, including sensitive mental health information, to Facebook and others for targeted advertising</w:t>
-      </w:r>
-      <w:r>
-        <w:rPr>
-          <w:sz w:val="24"/>
-          <w:szCs w:val="24"/>
-        </w:rPr>
-        <w:t xml:space="preserve">. </w:t>
-      </w:r>
-      <w:hyperlink r:id="rId8" w:tgtFrame="_new" w:history="1">
-        <w:r>
-          <w:rPr>
-            <w:rStyle w:val="Hyperlink"/>
-            <w:rFonts w:eastAsiaTheme="majorEastAsia"/>
-            <w:sz w:val="24"/>
-            <w:szCs w:val="24"/>
-          </w:rPr>
-          <w:t>https://www.ftc.gov/news-events/news/press-releases/2023/03/ftc-ban-betterhelp-revealing-consumers-data-including-sensitive-mental-health-information-facebook</w:t>
-        </w:r>
-      </w:hyperlink>
-    </w:p>
-    <w:p>
-      <w:pPr>
-        <w:spacing w:after="240" w:line="480" w:lineRule="auto"/>
-        <w:ind w:left="720" w:hanging="720"/>
-        <w:jc w:val="both"/>
-        <w:rPr>
-          <w:sz w:val="24"/>
-          <w:szCs w:val="24"/>
-        </w:rPr>
-      </w:pPr>
-      <w:r>
-        <w:rPr>
-          <w:sz w:val="24"/>
-          <w:szCs w:val="24"/>
-        </w:rPr>
-        <w:t xml:space="preserve">Federal Trade Commission. (2023, July 20). </w:t>
-      </w:r>
-      <w:r>
-        <w:rPr>
-          <w:rFonts w:eastAsiaTheme="majorEastAsia"/>
-          <w:i/>
-          <w:iCs/>
-          <w:sz w:val="24"/>
-          <w:szCs w:val="24"/>
-        </w:rPr>
         <w:t>FTC and HHS warn hospital systems and telehealth providers about privacy and security risks from online tracking technologies</w:t>
       </w:r>
       <w:r>
@@ -413,7 +398,7 @@
         </w:rPr>
         <w:t xml:space="preserve"> [Press release]. </w:t>
       </w:r>
-      <w:hyperlink r:id="rId9" w:history="1">
+      <w:hyperlink r:id="rId8" w:history="1">
         <w:r>
           <w:rPr>
             <w:rStyle w:val="Hyperlink"/>
@@ -491,7 +476,7 @@
         </w:rPr>
         <w:t xml:space="preserve">. </w:t>
       </w:r>
-      <w:hyperlink r:id="rId10" w:tgtFrame="_new" w:history="1">
+      <w:hyperlink r:id="rId9" w:tgtFrame="_new" w:history="1">
         <w:r>
           <w:rPr>
             <w:rStyle w:val="Hyperlink"/>
@@ -537,7 +522,7 @@
         </w:rPr>
         <w:t xml:space="preserve"> (FPF U.S. Legislation Report). Future of Privacy Forum. </w:t>
       </w:r>
-      <w:hyperlink r:id="rId11" w:tgtFrame="_new" w:history="1">
+      <w:hyperlink r:id="rId10" w:tgtFrame="_new" w:history="1">
         <w:r>
           <w:rPr>
             <w:rStyle w:val="Hyperlink"/>
@@ -616,7 +601,7 @@
         </w:rPr>
         <w:t xml:space="preserve">(2), 553. </w:t>
       </w:r>
-      <w:hyperlink r:id="rId12" w:tgtFrame="_new" w:history="1">
+      <w:hyperlink r:id="rId11" w:tgtFrame="_new" w:history="1">
         <w:r>
           <w:rPr>
             <w:rStyle w:val="Hyperlink"/>
@@ -642,6 +627,7 @@
         <w:rPr>
           <w:sz w:val="24"/>
           <w:szCs w:val="24"/>
+          <w:highlight w:val="yellow"/>
         </w:rPr>
         <w:t xml:space="preserve">Grimm, P. W., Capra, D. J., &amp; Joseph, G. P. (2017). </w:t>
       </w:r>
@@ -652,6 +638,7 @@
           <w:iCs/>
           <w:sz w:val="24"/>
           <w:szCs w:val="24"/>
+          <w:highlight w:val="yellow"/>
         </w:rPr>
         <w:t>Authenticating digital evidence</w:t>
       </w:r>
@@ -659,6 +646,7 @@
         <w:rPr>
           <w:sz w:val="24"/>
           <w:szCs w:val="24"/>
+          <w:highlight w:val="yellow"/>
         </w:rPr>
         <w:t xml:space="preserve">. </w:t>
       </w:r>
@@ -669,6 +657,7 @@
           <w:iCs/>
           <w:sz w:val="24"/>
           <w:szCs w:val="24"/>
+          <w:highlight w:val="yellow"/>
         </w:rPr>
         <w:t>Baylor Law Review, 69</w:t>
       </w:r>
@@ -676,16 +665,18 @@
         <w:rPr>
           <w:sz w:val="24"/>
           <w:szCs w:val="24"/>
+          <w:highlight w:val="yellow"/>
         </w:rPr>
         <w:t xml:space="preserve">(1), 1–55. </w:t>
       </w:r>
-      <w:hyperlink r:id="rId13" w:tgtFrame="_new" w:history="1">
+      <w:hyperlink r:id="rId12" w:tgtFrame="_new" w:history="1">
         <w:r>
           <w:rPr>
             <w:rStyle w:val="Hyperlink"/>
             <w:rFonts w:eastAsiaTheme="majorEastAsia"/>
             <w:sz w:val="24"/>
             <w:szCs w:val="24"/>
+            <w:highlight w:val="yellow"/>
           </w:rPr>
           <w:t>https://law.baylor.edu/sites/g/files/ecbvkj1546/files/2023-11/7_grimm_capra_joseph.pdf</w:t>
         </w:r>
@@ -782,7 +773,7 @@
         </w:rPr>
         <w:t xml:space="preserve"> (NIST Special Publication 800-86). National Institute of Standards and Technology. </w:t>
       </w:r>
-      <w:hyperlink r:id="rId14" w:history="1">
+      <w:hyperlink r:id="rId13" w:history="1">
         <w:r>
           <w:rPr>
             <w:rStyle w:val="Hyperlink"/>
@@ -835,7 +826,7 @@
         </w:rPr>
         <w:t xml:space="preserve">. Keysight Blogs. </w:t>
       </w:r>
-      <w:hyperlink r:id="rId15" w:tgtFrame="_new" w:history="1">
+      <w:hyperlink r:id="rId14" w:tgtFrame="_new" w:history="1">
         <w:r>
           <w:rPr>
             <w:rStyle w:val="Hyperlink"/>
@@ -881,7 +872,7 @@
         </w:rPr>
         <w:t xml:space="preserve">. University of Cincinnati Law Review Blog. </w:t>
       </w:r>
-      <w:hyperlink r:id="rId16" w:tgtFrame="_new" w:history="1">
+      <w:hyperlink r:id="rId15" w:tgtFrame="_new" w:history="1">
         <w:r>
           <w:rPr>
             <w:rStyle w:val="Hyperlink"/>
@@ -1158,6 +1149,7 @@
         <w:rPr>
           <w:sz w:val="24"/>
           <w:szCs w:val="24"/>
+          <w:highlight w:val="yellow"/>
         </w:rPr>
         <w:t xml:space="preserve">Sikos, L. F. (2020, March). </w:t>
       </w:r>
@@ -1168,6 +1160,7 @@
           <w:iCs/>
           <w:sz w:val="24"/>
           <w:szCs w:val="24"/>
+          <w:highlight w:val="yellow"/>
         </w:rPr>
         <w:t>Packet analysis for network forensics: A comprehensive survey</w:t>
       </w:r>
@@ -1175,6 +1168,7 @@
         <w:rPr>
           <w:sz w:val="24"/>
           <w:szCs w:val="24"/>
+          <w:highlight w:val="yellow"/>
         </w:rPr>
         <w:t xml:space="preserve">. </w:t>
       </w:r>
@@ -1185,6 +1179,7 @@
           <w:iCs/>
           <w:sz w:val="24"/>
           <w:szCs w:val="24"/>
+          <w:highlight w:val="yellow"/>
         </w:rPr>
         <w:t>Forensic Science International: Digital Investigation, 32</w:t>
       </w:r>
@@ -1192,15 +1187,9 @@
         <w:rPr>
           <w:sz w:val="24"/>
           <w:szCs w:val="24"/>
-        </w:rPr>
-        <w:t>, 200892</w:t>
-      </w:r>
-      <w:r>
-        <w:rPr>
-          <w:sz w:val="24"/>
-          <w:szCs w:val="24"/>
-        </w:rPr>
-        <w:t>. https://doi.org/10.1016/j.fsidi.2019.200892</w:t>
+          <w:highlight w:val="yellow"/>
+        </w:rPr>
+        <w:t>, 200892. https://doi.org/10.1016/j.fsidi.2019.200892</w:t>
       </w:r>
     </w:p>
     <w:p>
@@ -1315,7 +1304,7 @@
         </w:rPr>
         <w:t xml:space="preserve"> (2nd ed.). </w:t>
       </w:r>
-      <w:hyperlink r:id="rId17" w:tgtFrame="_new" w:history="1">
+      <w:hyperlink r:id="rId16" w:tgtFrame="_new" w:history="1">
         <w:r>
           <w:rPr>
             <w:rStyle w:val="Hyperlink"/>
@@ -1481,6 +1470,7 @@
         <w:rPr>
           <w:sz w:val="24"/>
           <w:szCs w:val="24"/>
+          <w:highlight w:val="yellow"/>
         </w:rPr>
         <w:t>Video Privacy Protection Act Amendments Act, Pub. L. No. 112-258, 126 Stat. 2414 (2012).</w:t>
       </w:r>
@@ -2446,6 +2436,18 @@
       <w:u w:val="single"/>
     </w:rPr>
   </w:style>
+  <w:style w:type="character" w:styleId="FollowedHyperlink">
+    <w:name w:val="FollowedHyperlink"/>
+    <w:basedOn w:val="DefaultParagraphFont"/>
+    <w:uiPriority w:val="99"/>
+    <w:semiHidden/>
+    <w:unhideWhenUsed/>
+    <w:rsid w:val="00B17A3E"/>
+    <w:rPr>
+      <w:color w:val="96607D" w:themeColor="followedHyperlink"/>
+      <w:u w:val="single"/>
+    </w:rPr>
+  </w:style>
 </w:styles>
 </file>
 
@@ -2765,6 +2767,23 @@
 </file>
 
 <file path=customXml/item1.xml><?xml version="1.0" encoding="utf-8"?>
+<p:properties xmlns:p="http://schemas.microsoft.com/office/2006/metadata/properties" xmlns:xsi="http://www.w3.org/2001/XMLSchema-instance" xmlns:pc="http://schemas.microsoft.com/office/infopath/2007/PartnerControls">
+  <documentManagement>
+    <_activity xmlns="2ef88289-76c0-491a-83aa-e4d241375661" xsi:nil="true"/>
+  </documentManagement>
+</p:properties>
+</file>
+
+<file path=customXml/item2.xml><?xml version="1.0" encoding="utf-8"?>
+<?mso-contentType ?>
+<FormTemplates xmlns="http://schemas.microsoft.com/sharepoint/v3/contenttype/forms">
+  <Display>DocumentLibraryForm</Display>
+  <Edit>DocumentLibraryForm</Edit>
+  <New>DocumentLibraryForm</New>
+</FormTemplates>
+</file>
+
+<file path=customXml/item3.xml><?xml version="1.0" encoding="utf-8"?>
 <ct:contentTypeSchema xmlns:ct="http://schemas.microsoft.com/office/2006/metadata/contentType" xmlns:ma="http://schemas.microsoft.com/office/2006/metadata/properties/metaAttributes" ct:_="" ma:_="" ma:contentTypeName="Document" ma:contentTypeID="0x010100FD9549D464B4A94E99D040AFC98A79E6" ma:contentTypeVersion="11" ma:contentTypeDescription="Create a new document." ma:contentTypeScope="" ma:versionID="f33b2a9579b713009c80dbbdeda8043d">
   <xsd:schema xmlns:xsd="http://www.w3.org/2001/XMLSchema" xmlns:xs="http://www.w3.org/2001/XMLSchema" xmlns:p="http://schemas.microsoft.com/office/2006/metadata/properties" xmlns:ns3="2ef88289-76c0-491a-83aa-e4d241375661" xmlns:ns4="ef5b3231-df22-4135-98e0-cf0d3b79c4ec" targetNamespace="http://schemas.microsoft.com/office/2006/metadata/properties" ma:root="true" ma:fieldsID="86ae5baef8828bc825c75b7f0e38b5d5" ns3:_="" ns4:_="">
     <xsd:import namespace="2ef88289-76c0-491a-83aa-e4d241375661"/>
@@ -2957,24 +2976,25 @@
 </ct:contentTypeSchema>
 </file>
 
-<file path=customXml/item2.xml><?xml version="1.0" encoding="utf-8"?>
-<?mso-contentType ?>
-<FormTemplates xmlns="http://schemas.microsoft.com/sharepoint/v3/contenttype/forms">
-  <Display>DocumentLibraryForm</Display>
-  <Edit>DocumentLibraryForm</Edit>
-  <New>DocumentLibraryForm</New>
-</FormTemplates>
+<file path=customXml/itemProps1.xml><?xml version="1.0" encoding="utf-8"?>
+<ds:datastoreItem xmlns:ds="http://schemas.openxmlformats.org/officeDocument/2006/customXml" ds:itemID="{CB4AD4BB-465F-4909-9E4E-1C822DC757D1}">
+  <ds:schemaRefs>
+    <ds:schemaRef ds:uri="http://schemas.microsoft.com/office/2006/metadata/properties"/>
+    <ds:schemaRef ds:uri="http://schemas.microsoft.com/office/infopath/2007/PartnerControls"/>
+    <ds:schemaRef ds:uri="2ef88289-76c0-491a-83aa-e4d241375661"/>
+  </ds:schemaRefs>
+</ds:datastoreItem>
 </file>
 
-<file path=customXml/item3.xml><?xml version="1.0" encoding="utf-8"?>
-<p:properties xmlns:p="http://schemas.microsoft.com/office/2006/metadata/properties" xmlns:xsi="http://www.w3.org/2001/XMLSchema-instance" xmlns:pc="http://schemas.microsoft.com/office/infopath/2007/PartnerControls">
-  <documentManagement>
-    <_activity xmlns="2ef88289-76c0-491a-83aa-e4d241375661" xsi:nil="true"/>
-  </documentManagement>
-</p:properties>
+<file path=customXml/itemProps2.xml><?xml version="1.0" encoding="utf-8"?>
+<ds:datastoreItem xmlns:ds="http://schemas.openxmlformats.org/officeDocument/2006/customXml" ds:itemID="{F37CF0B0-D282-4EA6-8C48-1746D35E9AE3}">
+  <ds:schemaRefs>
+    <ds:schemaRef ds:uri="http://schemas.microsoft.com/sharepoint/v3/contenttype/forms"/>
+  </ds:schemaRefs>
+</ds:datastoreItem>
 </file>
 
-<file path=customXml/itemProps1.xml><?xml version="1.0" encoding="utf-8"?>
+<file path=customXml/itemProps3.xml><?xml version="1.0" encoding="utf-8"?>
 <ds:datastoreItem xmlns:ds="http://schemas.openxmlformats.org/officeDocument/2006/customXml" ds:itemID="{2F15E6B3-D023-49AF-8EC7-03CC6436481A}">
   <ds:schemaRefs>
     <ds:schemaRef ds:uri="http://schemas.microsoft.com/office/2006/metadata/contentType"/>
@@ -2991,22 +3011,4 @@
     <ds:schemaRef ds:uri="http://schemas.microsoft.com/internal/obd"/>
   </ds:schemaRefs>
 </ds:datastoreItem>
-</file>
-
-<file path=customXml/itemProps2.xml><?xml version="1.0" encoding="utf-8"?>
-<ds:datastoreItem xmlns:ds="http://schemas.openxmlformats.org/officeDocument/2006/customXml" ds:itemID="{F37CF0B0-D282-4EA6-8C48-1746D35E9AE3}">
-  <ds:schemaRefs>
-    <ds:schemaRef ds:uri="http://schemas.microsoft.com/sharepoint/v3/contenttype/forms"/>
-  </ds:schemaRefs>
-</ds:datastoreItem>
-</file>
-
-<file path=customXml/itemProps3.xml><?xml version="1.0" encoding="utf-8"?>
-<ds:datastoreItem xmlns:ds="http://schemas.openxmlformats.org/officeDocument/2006/customXml" ds:itemID="{CB4AD4BB-465F-4909-9E4E-1C822DC757D1}">
-  <ds:schemaRefs>
-    <ds:schemaRef ds:uri="http://schemas.microsoft.com/office/2006/metadata/properties"/>
-    <ds:schemaRef ds:uri="http://schemas.microsoft.com/office/infopath/2007/PartnerControls"/>
-    <ds:schemaRef ds:uri="2ef88289-76c0-491a-83aa-e4d241375661"/>
-  </ds:schemaRefs>
-</ds:datastoreItem>
 </file>
</xml_diff>